<commit_message>
Refactor code structure for improved readability and maintainability create HW6 & STUDENT_ROM
</commit_message>
<xml_diff>
--- a/school/Lab_4_2026/Lab4_2026_更正.docx
+++ b/school/Lab_4_2026/Lab4_2026_更正.docx
@@ -448,7 +448,7 @@
           <v:shape id="_x0000_i1025" type="#_x0000_t75" style="width:205.5pt;height:211pt" o:ole="">
             <v:imagedata r:id="rId7" o:title=""/>
           </v:shape>
-          <o:OLEObject Type="Embed" ProgID="Visio.Drawing.15" ShapeID="_x0000_i1025" DrawAspect="Content" ObjectID="_1840967451" r:id="rId8"/>
+          <o:OLEObject Type="Embed" ProgID="Visio.Drawing.15" ShapeID="_x0000_i1025" DrawAspect="Content" ObjectID="_1840996774" r:id="rId8"/>
         </w:object>
       </w:r>
     </w:p>
@@ -593,20 +593,22 @@
     <w:p>
       <w:pPr>
         <w:rPr>
-          <w:rFonts w:ascii="標楷體" w:eastAsia="標楷體" w:hAnsi="標楷體" w:cs="Times New Roman"/>
-          <w:sz w:val="28"/>
-          <w:szCs w:val="28"/>
-        </w:rPr>
-      </w:pPr>
-      <w:r>
-        <w:rPr>
-          <w:noProof/>
+          <w:rFonts w:ascii="標楷體" w:eastAsia="標楷體" w:hAnsi="標楷體" w:cs="Times New Roman" w:hint="eastAsia"/>
+          <w:sz w:val="28"/>
+          <w:szCs w:val="28"/>
+        </w:rPr>
+      </w:pPr>
+      <w:r>
+        <w:rPr>
+          <w:rFonts w:ascii="標楷體" w:eastAsia="標楷體" w:hAnsi="標楷體" w:cs="Times New Roman"/>
+          <w:sz w:val="28"/>
+          <w:szCs w:val="28"/>
         </w:rPr>
         <w:drawing>
-          <wp:inline distT="0" distB="0" distL="0" distR="0" wp14:anchorId="3DD029B6" wp14:editId="0278D6D2">
-            <wp:extent cx="6645910" cy="958850"/>
-            <wp:effectExtent l="0" t="0" r="2540" b="0"/>
-            <wp:docPr id="2" name="圖片 2"/>
+          <wp:inline distT="0" distB="0" distL="0" distR="0" wp14:anchorId="0563549C" wp14:editId="5A3AB495">
+            <wp:extent cx="6645910" cy="796925"/>
+            <wp:effectExtent l="0" t="0" r="2540" b="3175"/>
+            <wp:docPr id="5" name="圖片 5"/>
             <wp:cNvGraphicFramePr>
               <a:graphicFrameLocks xmlns:a="http://schemas.openxmlformats.org/drawingml/2006/main" noChangeAspect="1"/>
             </wp:cNvGraphicFramePr>
@@ -617,27 +619,20 @@
                     <pic:cNvPr id="1" name=""/>
                     <pic:cNvPicPr/>
                   </pic:nvPicPr>
-                  <pic:blipFill rotWithShape="1">
+                  <pic:blipFill>
                     <a:blip r:embed="rId9"/>
-                    <a:srcRect t="11384" b="64059"/>
-                    <a:stretch/>
+                    <a:stretch>
+                      <a:fillRect/>
+                    </a:stretch>
                   </pic:blipFill>
-                  <pic:spPr bwMode="auto">
+                  <pic:spPr>
                     <a:xfrm>
                       <a:off x="0" y="0"/>
-                      <a:ext cx="6645910" cy="958850"/>
+                      <a:ext cx="6645910" cy="796925"/>
                     </a:xfrm>
                     <a:prstGeom prst="rect">
                       <a:avLst/>
                     </a:prstGeom>
-                    <a:ln>
-                      <a:noFill/>
-                    </a:ln>
-                    <a:extLst>
-                      <a:ext uri="{53640926-AAD7-44D8-BBD7-CCE9431645EC}">
-                        <a14:shadowObscured xmlns:a14="http://schemas.microsoft.com/office/drawing/2010/main"/>
-                      </a:ext>
-                    </a:extLst>
                   </pic:spPr>
                 </pic:pic>
               </a:graphicData>

</xml_diff>